<commit_message>
test(native-capture): recapture the Safari list and table fixtures from documents made with Word's own libraries; the tables document ends with one empty paragraph
</commit_message>
<xml_diff>
--- a/e2e/native-office-capture/fixtures/word-table-text-safari/source.docx
+++ b/e2e/native-office-capture/fixtures/word-table-text-safari/source.docx
@@ -12,30 +12,19 @@
     </w:p>
     <w:tbl>
       <w:tblPr>
-        <w:tblW w:w="9026" w:type="dxa"/>
-        <w:tblBorders>
-          <w:top w:val="single" w:sz="4" w:space="0" w:color="auto"/>
-          <w:left w:val="single" w:sz="4" w:space="0" w:color="auto"/>
-          <w:bottom w:val="single" w:sz="4" w:space="0" w:color="auto"/>
-          <w:right w:val="single" w:sz="4" w:space="0" w:color="auto"/>
-          <w:insideH w:val="single" w:sz="4" w:space="0" w:color="auto"/>
-          <w:insideV w:val="single" w:sz="4" w:space="0" w:color="auto"/>
-        </w:tblBorders>
-        <w:tblLayout w:type="fixed"/>
-        <w:tblLook w:val="0020" w:firstRow="1" w:lastRow="0" w:firstColumn="0" w:lastColumn="0" w:noHBand="0" w:noVBand="0"/>
+        <w:tblStyle w:val="TableGrid"/>
+        <w:tblW w:w="0" w:type="auto"/>
+        <w:tblLook w:val="04A0" w:firstRow="1" w:lastRow="0" w:firstColumn="1" w:lastColumn="0" w:noHBand="0" w:noVBand="1"/>
       </w:tblPr>
       <w:tblGrid>
-        <w:gridCol w:w="3008"/>
-        <w:gridCol w:w="3009"/>
-        <w:gridCol w:w="3009"/>
+        <w:gridCol w:w="3005"/>
+        <w:gridCol w:w="3005"/>
+        <w:gridCol w:w="3006"/>
       </w:tblGrid>
       <w:tr>
         <w:tc>
           <w:tcPr>
-            <w:tcW w:w="3008" w:type="dxa"/>
-            <w:tcBorders>
-              <w:bottom w:val="single" w:sz="4" w:space="0" w:color="auto"/>
-            </w:tcBorders>
+            <w:tcW w:w="3005" w:type="dxa"/>
           </w:tcPr>
           <w:p>
             <w:r>
@@ -45,7 +34,7 @@
         </w:tc>
         <w:tc>
           <w:tcPr>
-            <w:tcW w:w="3009" w:type="dxa"/>
+            <w:tcW w:w="3005" w:type="dxa"/>
           </w:tcPr>
           <w:p>
             <w:r>
@@ -55,11 +44,20 @@
         </w:tc>
         <w:tc>
           <w:tcPr>
-            <w:tcW w:w="3009" w:type="dxa"/>
+            <w:tcW w:w="3006" w:type="dxa"/>
           </w:tcPr>
           <w:p>
             <w:r>
-              <w:t>T04 Column C</w:t>
+              <w:t>T0</w:t>
+            </w:r>
+            <w:r>
+              <w:t>4</w:t>
+            </w:r>
+            <w:r>
+              <w:t xml:space="preserve"> Column </w:t>
+            </w:r>
+            <w:r>
+              <w:t>C</w:t>
             </w:r>
           </w:p>
         </w:tc>
@@ -67,8 +65,8 @@
       <w:tr>
         <w:tc>
           <w:tcPr>
-            <w:tcW w:w="3008" w:type="dxa"/>
-            <w:shd w:val="clear" w:color="auto" w:fill="D9D9D9"/>
+            <w:tcW w:w="3005" w:type="dxa"/>
+            <w:shd w:val="clear" w:color="auto" w:fill="D9D9D9" w:themeFill="background1" w:themeFillShade="D9"/>
           </w:tcPr>
           <w:p>
             <w:r>
@@ -78,7 +76,7 @@
         </w:tc>
         <w:tc>
           <w:tcPr>
-            <w:tcW w:w="3009" w:type="dxa"/>
+            <w:tcW w:w="3005" w:type="dxa"/>
           </w:tcPr>
           <w:p>
             <w:r>
@@ -88,7 +86,7 @@
         </w:tc>
         <w:tc>
           <w:tcPr>
-            <w:tcW w:w="3009" w:type="dxa"/>
+            <w:tcW w:w="3006" w:type="dxa"/>
           </w:tcPr>
           <w:p>
             <w:r>
@@ -100,7 +98,7 @@
       <w:tr>
         <w:tc>
           <w:tcPr>
-            <w:tcW w:w="6017" w:type="dxa"/>
+            <w:tcW w:w="6010" w:type="dxa"/>
             <w:gridSpan w:val="2"/>
           </w:tcPr>
           <w:p>
@@ -111,7 +109,7 @@
         </w:tc>
         <w:tc>
           <w:tcPr>
-            <w:tcW w:w="3009" w:type="dxa"/>
+            <w:tcW w:w="3006" w:type="dxa"/>
           </w:tcPr>
           <w:p>
             <w:r>
@@ -128,18 +126,26 @@
     </w:p>
     <w:tbl>
       <w:tblPr>
+        <w:tblStyle w:val="TableGrid"/>
         <w:tblW w:w="0" w:type="auto"/>
-        <w:tblLayout w:type="fixed"/>
-        <w:tblLook w:val="0000" w:firstRow="0" w:lastRow="0" w:firstColumn="0" w:lastColumn="0" w:noHBand="0" w:noVBand="0"/>
+        <w:tblBorders>
+          <w:top w:val="none" w:sz="0" w:space="0" w:color="auto"/>
+          <w:left w:val="none" w:sz="0" w:space="0" w:color="auto"/>
+          <w:bottom w:val="none" w:sz="0" w:space="0" w:color="auto"/>
+          <w:right w:val="none" w:sz="0" w:space="0" w:color="auto"/>
+          <w:insideH w:val="none" w:sz="0" w:space="0" w:color="auto"/>
+          <w:insideV w:val="none" w:sz="0" w:space="0" w:color="auto"/>
+        </w:tblBorders>
+        <w:tblLook w:val="04A0" w:firstRow="1" w:lastRow="0" w:firstColumn="1" w:lastColumn="0" w:noHBand="0" w:noVBand="1"/>
       </w:tblPr>
       <w:tblGrid>
-        <w:gridCol w:w="4513"/>
-        <w:gridCol w:w="4513"/>
+        <w:gridCol w:w="4508"/>
+        <w:gridCol w:w="4508"/>
       </w:tblGrid>
       <w:tr>
         <w:tc>
           <w:tcPr>
-            <w:tcW w:w="4513" w:type="dxa"/>
+            <w:tcW w:w="4508" w:type="dxa"/>
           </w:tcPr>
           <w:p>
             <w:r>
@@ -149,7 +155,7 @@
         </w:tc>
         <w:tc>
           <w:tcPr>
-            <w:tcW w:w="4513" w:type="dxa"/>
+            <w:tcW w:w="4508" w:type="dxa"/>
           </w:tcPr>
           <w:p>
             <w:r>
@@ -162,25 +168,17 @@
     <w:p/>
     <w:tbl>
       <w:tblPr>
+        <w:tblStyle w:val="TableGrid"/>
         <w:tblW w:w="0" w:type="auto"/>
-        <w:tblBorders>
-          <w:top w:val="single" w:sz="4" w:space="0" w:color="auto"/>
-          <w:left w:val="single" w:sz="4" w:space="0" w:color="auto"/>
-          <w:bottom w:val="single" w:sz="4" w:space="0" w:color="auto"/>
-          <w:right w:val="single" w:sz="4" w:space="0" w:color="auto"/>
-          <w:insideH w:val="single" w:sz="4" w:space="0" w:color="auto"/>
-          <w:insideV w:val="single" w:sz="4" w:space="0" w:color="auto"/>
-        </w:tblBorders>
-        <w:tblLayout w:type="fixed"/>
-        <w:tblLook w:val="0000" w:firstRow="0" w:lastRow="0" w:firstColumn="0" w:lastColumn="0" w:noHBand="0" w:noVBand="0"/>
+        <w:tblLook w:val="04A0" w:firstRow="1" w:lastRow="0" w:firstColumn="1" w:lastColumn="0" w:noHBand="0" w:noVBand="1"/>
       </w:tblPr>
       <w:tblGrid>
-        <w:gridCol w:w="9026"/>
+        <w:gridCol w:w="9016"/>
       </w:tblGrid>
       <w:tr>
         <w:tc>
           <w:tcPr>
-            <w:tcW w:w="9026" w:type="dxa"/>
+            <w:tcW w:w="9016" w:type="dxa"/>
           </w:tcPr>
           <w:p>
             <w:r>
@@ -215,7 +213,6 @@
       </w:tr>
     </w:tbl>
     <w:p/>
-    <w:p/>
     <w:sectPr>
       <w:pgSz w:w="11906" w:h="16838"/>
       <w:pgMar w:top="1440" w:right="1440" w:bottom="1440" w:left="1440" w:header="708" w:footer="708" w:gutter="0"/>
@@ -229,11 +226,10 @@
 <file path=word/numbering.xml><?xml version="1.0" encoding="utf-8"?>
 <w:numbering xmlns:wpc="http://schemas.microsoft.com/office/word/2010/wordprocessingCanvas" xmlns:cx="http://schemas.microsoft.com/office/drawing/2014/chartex" xmlns:cx1="http://schemas.microsoft.com/office/drawing/2015/9/8/chartex" xmlns:cx2="http://schemas.microsoft.com/office/drawing/2015/10/21/chartex" xmlns:cx3="http://schemas.microsoft.com/office/drawing/2016/5/9/chartex" xmlns:cx4="http://schemas.microsoft.com/office/drawing/2016/5/10/chartex" xmlns:cx5="http://schemas.microsoft.com/office/drawing/2016/5/11/chartex" xmlns:cx6="http://schemas.microsoft.com/office/drawing/2016/5/12/chartex" xmlns:cx7="http://schemas.microsoft.com/office/drawing/2016/5/13/chartex" xmlns:cx8="http://schemas.microsoft.com/office/drawing/2016/5/14/chartex" xmlns:mc="http://schemas.openxmlformats.org/markup-compatibility/2006" xmlns:m="http://schemas.openxmlformats.org/officeDocument/2006/math" xmlns:aink="http://schemas.microsoft.com/office/drawing/2016/ink" xmlns:am3d="http://schemas.microsoft.com/office/drawing/2017/model3d" xmlns:oel="http://schemas.microsoft.com/office/2019/extlst" xmlns:r="http://schemas.openxmlformats.org/officeDocument/2006/relationships" xmlns:wp14="http://schemas.microsoft.com/office/word/2010/wordprocessingDrawing" xmlns:wp="http://schemas.openxmlformats.org/drawingml/2006/wordprocessingDrawing" xmlns:wpg="http://schemas.microsoft.com/office/word/2010/wordprocessingGroup" xmlns:wpi="http://schemas.microsoft.com/office/word/2010/wordprocessingInk" xmlns:wps="http://schemas.microsoft.com/office/word/2010/wordprocessingShape" xmlns:o="urn:schemas-microsoft-com:office:office" xmlns:v="urn:schemas-microsoft-com:vml" xmlns:w10="urn:schemas-microsoft-com:office:word" xmlns:w="http://schemas.openxmlformats.org/wordprocessingml/2006/main" xmlns:w14="http://schemas.microsoft.com/office/word/2010/wordml" xmlns:w15="http://schemas.microsoft.com/office/word/2012/wordml" xmlns:w16cex="http://schemas.microsoft.com/office/word/2018/wordml/cex" xmlns:w16cid="http://schemas.microsoft.com/office/word/2016/wordml/cid" xmlns:w16="http://schemas.microsoft.com/office/word/2018/wordml" xmlns:w16sdtdh="http://schemas.microsoft.com/office/word/2020/wordml/sdtdatahash" xmlns:w16sdtfl="http://schemas.microsoft.com/office/word/2024/wordml/sdtformatlock" xmlns:w16se="http://schemas.microsoft.com/office/word/2015/wordml/symex" xmlns:w16du="http://schemas.microsoft.com/office/word/2023/wordml/word16du" xmlns:wne="http://schemas.microsoft.com/office/word/2006/wordml" mc:Ignorable="w14 w15 w16se w16cid w16 w16cex w16sdtdh w16sdtfl w16du wp14">
   <w:abstractNum w:abstractNumId="0" w15:restartNumberingAfterBreak="0">
-    <w:nsid w:val="51F16164"/>
-    <w:multiLevelType w:val="singleLevel"/>
-    <w:tmpl w:val="08090001"/>
-    <w:name w:val="D3 pictureBullet2"/>
-    <w:lvl w:ilvl="0">
+    <w:nsid w:val="3CC3535A"/>
+    <w:multiLevelType w:val="hybridMultilevel"/>
+    <w:tmpl w:val="E57416DE"/>
+    <w:lvl w:ilvl="0" w:tplc="08090001">
       <w:start w:val="1"/>
       <w:numFmt w:val="bullet"/>
       <w:lvlText w:val=""/>
@@ -245,8 +241,104 @@
         <w:rFonts w:ascii="Symbol" w:hAnsi="Symbol" w:hint="default"/>
       </w:rPr>
     </w:lvl>
+    <w:lvl w:ilvl="1" w:tplc="08090003" w:tentative="1">
+      <w:start w:val="1"/>
+      <w:numFmt w:val="bullet"/>
+      <w:lvlText w:val="o"/>
+      <w:lvlJc w:val="left"/>
+      <w:pPr>
+        <w:ind w:left="1440" w:hanging="360"/>
+      </w:pPr>
+      <w:rPr>
+        <w:rFonts w:ascii="Courier New" w:hAnsi="Courier New" w:cs="Courier New" w:hint="default"/>
+      </w:rPr>
+    </w:lvl>
+    <w:lvl w:ilvl="2" w:tplc="08090005" w:tentative="1">
+      <w:start w:val="1"/>
+      <w:numFmt w:val="bullet"/>
+      <w:lvlText w:val=""/>
+      <w:lvlJc w:val="left"/>
+      <w:pPr>
+        <w:ind w:left="2160" w:hanging="360"/>
+      </w:pPr>
+      <w:rPr>
+        <w:rFonts w:ascii="Wingdings" w:hAnsi="Wingdings" w:hint="default"/>
+      </w:rPr>
+    </w:lvl>
+    <w:lvl w:ilvl="3" w:tplc="08090001" w:tentative="1">
+      <w:start w:val="1"/>
+      <w:numFmt w:val="bullet"/>
+      <w:lvlText w:val=""/>
+      <w:lvlJc w:val="left"/>
+      <w:pPr>
+        <w:ind w:left="2880" w:hanging="360"/>
+      </w:pPr>
+      <w:rPr>
+        <w:rFonts w:ascii="Symbol" w:hAnsi="Symbol" w:hint="default"/>
+      </w:rPr>
+    </w:lvl>
+    <w:lvl w:ilvl="4" w:tplc="08090003" w:tentative="1">
+      <w:start w:val="1"/>
+      <w:numFmt w:val="bullet"/>
+      <w:lvlText w:val="o"/>
+      <w:lvlJc w:val="left"/>
+      <w:pPr>
+        <w:ind w:left="3600" w:hanging="360"/>
+      </w:pPr>
+      <w:rPr>
+        <w:rFonts w:ascii="Courier New" w:hAnsi="Courier New" w:cs="Courier New" w:hint="default"/>
+      </w:rPr>
+    </w:lvl>
+    <w:lvl w:ilvl="5" w:tplc="08090005" w:tentative="1">
+      <w:start w:val="1"/>
+      <w:numFmt w:val="bullet"/>
+      <w:lvlText w:val=""/>
+      <w:lvlJc w:val="left"/>
+      <w:pPr>
+        <w:ind w:left="4320" w:hanging="360"/>
+      </w:pPr>
+      <w:rPr>
+        <w:rFonts w:ascii="Wingdings" w:hAnsi="Wingdings" w:hint="default"/>
+      </w:rPr>
+    </w:lvl>
+    <w:lvl w:ilvl="6" w:tplc="08090001" w:tentative="1">
+      <w:start w:val="1"/>
+      <w:numFmt w:val="bullet"/>
+      <w:lvlText w:val=""/>
+      <w:lvlJc w:val="left"/>
+      <w:pPr>
+        <w:ind w:left="5040" w:hanging="360"/>
+      </w:pPr>
+      <w:rPr>
+        <w:rFonts w:ascii="Symbol" w:hAnsi="Symbol" w:hint="default"/>
+      </w:rPr>
+    </w:lvl>
+    <w:lvl w:ilvl="7" w:tplc="08090003" w:tentative="1">
+      <w:start w:val="1"/>
+      <w:numFmt w:val="bullet"/>
+      <w:lvlText w:val="o"/>
+      <w:lvlJc w:val="left"/>
+      <w:pPr>
+        <w:ind w:left="5760" w:hanging="360"/>
+      </w:pPr>
+      <w:rPr>
+        <w:rFonts w:ascii="Courier New" w:hAnsi="Courier New" w:cs="Courier New" w:hint="default"/>
+      </w:rPr>
+    </w:lvl>
+    <w:lvl w:ilvl="8" w:tplc="08090005" w:tentative="1">
+      <w:start w:val="1"/>
+      <w:numFmt w:val="bullet"/>
+      <w:lvlText w:val=""/>
+      <w:lvlJc w:val="left"/>
+      <w:pPr>
+        <w:ind w:left="6480" w:hanging="360"/>
+      </w:pPr>
+      <w:rPr>
+        <w:rFonts w:ascii="Wingdings" w:hAnsi="Wingdings" w:hint="default"/>
+      </w:rPr>
+    </w:lvl>
   </w:abstractNum>
-  <w:num w:numId="1" w16cid:durableId="1555508335">
+  <w:num w:numId="1" w16cid:durableId="1433041812">
     <w:abstractNumId w:val="0"/>
   </w:num>
 </w:numbering>
@@ -660,7 +752,7 @@
     <w:link w:val="Heading1Char"/>
     <w:uiPriority w:val="9"/>
     <w:qFormat/>
-    <w:rsid w:val="00A94015"/>
+    <w:rsid w:val="003F4731"/>
     <w:pPr>
       <w:keepNext/>
       <w:keepLines/>
@@ -683,7 +775,7 @@
     <w:semiHidden/>
     <w:unhideWhenUsed/>
     <w:qFormat/>
-    <w:rsid w:val="00A94015"/>
+    <w:rsid w:val="003F4731"/>
     <w:pPr>
       <w:keepNext/>
       <w:keepLines/>
@@ -706,7 +798,7 @@
     <w:semiHidden/>
     <w:unhideWhenUsed/>
     <w:qFormat/>
-    <w:rsid w:val="00A94015"/>
+    <w:rsid w:val="003F4731"/>
     <w:pPr>
       <w:keepNext/>
       <w:keepLines/>
@@ -729,7 +821,7 @@
     <w:semiHidden/>
     <w:unhideWhenUsed/>
     <w:qFormat/>
-    <w:rsid w:val="00A94015"/>
+    <w:rsid w:val="003F4731"/>
     <w:pPr>
       <w:keepNext/>
       <w:keepLines/>
@@ -752,7 +844,7 @@
     <w:semiHidden/>
     <w:unhideWhenUsed/>
     <w:qFormat/>
-    <w:rsid w:val="00A94015"/>
+    <w:rsid w:val="003F4731"/>
     <w:pPr>
       <w:keepNext/>
       <w:keepLines/>
@@ -773,7 +865,7 @@
     <w:semiHidden/>
     <w:unhideWhenUsed/>
     <w:qFormat/>
-    <w:rsid w:val="00A94015"/>
+    <w:rsid w:val="003F4731"/>
     <w:pPr>
       <w:keepNext/>
       <w:keepLines/>
@@ -796,7 +888,7 @@
     <w:semiHidden/>
     <w:unhideWhenUsed/>
     <w:qFormat/>
-    <w:rsid w:val="00A94015"/>
+    <w:rsid w:val="003F4731"/>
     <w:pPr>
       <w:keepNext/>
       <w:keepLines/>
@@ -817,7 +909,7 @@
     <w:semiHidden/>
     <w:unhideWhenUsed/>
     <w:qFormat/>
-    <w:rsid w:val="00A94015"/>
+    <w:rsid w:val="003F4731"/>
     <w:pPr>
       <w:keepNext/>
       <w:keepLines/>
@@ -840,7 +932,7 @@
     <w:semiHidden/>
     <w:unhideWhenUsed/>
     <w:qFormat/>
-    <w:rsid w:val="00A94015"/>
+    <w:rsid w:val="003F4731"/>
     <w:pPr>
       <w:keepNext/>
       <w:keepLines/>
@@ -884,7 +976,7 @@
     <w:basedOn w:val="DefaultParagraphFont"/>
     <w:link w:val="Heading1"/>
     <w:uiPriority w:val="9"/>
-    <w:rsid w:val="00A94015"/>
+    <w:rsid w:val="003F4731"/>
     <w:rPr>
       <w:rFonts w:asciiTheme="majorHAnsi" w:eastAsiaTheme="majorEastAsia" w:hAnsiTheme="majorHAnsi" w:cstheme="majorBidi"/>
       <w:color w:val="0F4761" w:themeColor="accent1" w:themeShade="BF"/>
@@ -898,7 +990,7 @@
     <w:link w:val="Heading2"/>
     <w:uiPriority w:val="9"/>
     <w:semiHidden/>
-    <w:rsid w:val="00A94015"/>
+    <w:rsid w:val="003F4731"/>
     <w:rPr>
       <w:rFonts w:asciiTheme="majorHAnsi" w:eastAsiaTheme="majorEastAsia" w:hAnsiTheme="majorHAnsi" w:cstheme="majorBidi"/>
       <w:color w:val="0F4761" w:themeColor="accent1" w:themeShade="BF"/>
@@ -912,7 +1004,7 @@
     <w:link w:val="Heading3"/>
     <w:uiPriority w:val="9"/>
     <w:semiHidden/>
-    <w:rsid w:val="00A94015"/>
+    <w:rsid w:val="003F4731"/>
     <w:rPr>
       <w:rFonts w:eastAsiaTheme="majorEastAsia" w:cstheme="majorBidi"/>
       <w:color w:val="0F4761" w:themeColor="accent1" w:themeShade="BF"/>
@@ -926,7 +1018,7 @@
     <w:link w:val="Heading4"/>
     <w:uiPriority w:val="9"/>
     <w:semiHidden/>
-    <w:rsid w:val="00A94015"/>
+    <w:rsid w:val="003F4731"/>
     <w:rPr>
       <w:rFonts w:eastAsiaTheme="majorEastAsia" w:cstheme="majorBidi"/>
       <w:i/>
@@ -940,7 +1032,7 @@
     <w:link w:val="Heading5"/>
     <w:uiPriority w:val="9"/>
     <w:semiHidden/>
-    <w:rsid w:val="00A94015"/>
+    <w:rsid w:val="003F4731"/>
     <w:rPr>
       <w:rFonts w:eastAsiaTheme="majorEastAsia" w:cstheme="majorBidi"/>
       <w:color w:val="0F4761" w:themeColor="accent1" w:themeShade="BF"/>
@@ -952,7 +1044,7 @@
     <w:link w:val="Heading6"/>
     <w:uiPriority w:val="9"/>
     <w:semiHidden/>
-    <w:rsid w:val="00A94015"/>
+    <w:rsid w:val="003F4731"/>
     <w:rPr>
       <w:rFonts w:eastAsiaTheme="majorEastAsia" w:cstheme="majorBidi"/>
       <w:i/>
@@ -966,7 +1058,7 @@
     <w:link w:val="Heading7"/>
     <w:uiPriority w:val="9"/>
     <w:semiHidden/>
-    <w:rsid w:val="00A94015"/>
+    <w:rsid w:val="003F4731"/>
     <w:rPr>
       <w:rFonts w:eastAsiaTheme="majorEastAsia" w:cstheme="majorBidi"/>
       <w:color w:val="595959" w:themeColor="text1" w:themeTint="A6"/>
@@ -978,7 +1070,7 @@
     <w:link w:val="Heading8"/>
     <w:uiPriority w:val="9"/>
     <w:semiHidden/>
-    <w:rsid w:val="00A94015"/>
+    <w:rsid w:val="003F4731"/>
     <w:rPr>
       <w:rFonts w:eastAsiaTheme="majorEastAsia" w:cstheme="majorBidi"/>
       <w:i/>
@@ -992,7 +1084,7 @@
     <w:link w:val="Heading9"/>
     <w:uiPriority w:val="9"/>
     <w:semiHidden/>
-    <w:rsid w:val="00A94015"/>
+    <w:rsid w:val="003F4731"/>
     <w:rPr>
       <w:rFonts w:eastAsiaTheme="majorEastAsia" w:cstheme="majorBidi"/>
       <w:color w:val="272727" w:themeColor="text1" w:themeTint="D8"/>
@@ -1005,7 +1097,7 @@
     <w:link w:val="TitleChar"/>
     <w:uiPriority w:val="10"/>
     <w:qFormat/>
-    <w:rsid w:val="00A94015"/>
+    <w:rsid w:val="003F4731"/>
     <w:pPr>
       <w:spacing w:after="80" w:line="240" w:lineRule="auto"/>
       <w:contextualSpacing/>
@@ -1023,7 +1115,7 @@
     <w:basedOn w:val="DefaultParagraphFont"/>
     <w:link w:val="Title"/>
     <w:uiPriority w:val="10"/>
-    <w:rsid w:val="00A94015"/>
+    <w:rsid w:val="003F4731"/>
     <w:rPr>
       <w:rFonts w:asciiTheme="majorHAnsi" w:eastAsiaTheme="majorEastAsia" w:hAnsiTheme="majorHAnsi" w:cstheme="majorBidi"/>
       <w:spacing w:val="-10"/>
@@ -1039,7 +1131,7 @@
     <w:link w:val="SubtitleChar"/>
     <w:uiPriority w:val="11"/>
     <w:qFormat/>
-    <w:rsid w:val="00A94015"/>
+    <w:rsid w:val="003F4731"/>
     <w:pPr>
       <w:numPr>
         <w:ilvl w:val="1"/>
@@ -1058,7 +1150,7 @@
     <w:basedOn w:val="DefaultParagraphFont"/>
     <w:link w:val="Subtitle"/>
     <w:uiPriority w:val="11"/>
-    <w:rsid w:val="00A94015"/>
+    <w:rsid w:val="003F4731"/>
     <w:rPr>
       <w:rFonts w:eastAsiaTheme="majorEastAsia" w:cstheme="majorBidi"/>
       <w:color w:val="595959" w:themeColor="text1" w:themeTint="A6"/>
@@ -1074,7 +1166,7 @@
     <w:link w:val="QuoteChar"/>
     <w:uiPriority w:val="29"/>
     <w:qFormat/>
-    <w:rsid w:val="00A94015"/>
+    <w:rsid w:val="003F4731"/>
     <w:pPr>
       <w:spacing w:before="160"/>
       <w:jc w:val="center"/>
@@ -1090,7 +1182,7 @@
     <w:basedOn w:val="DefaultParagraphFont"/>
     <w:link w:val="Quote"/>
     <w:uiPriority w:val="29"/>
-    <w:rsid w:val="00A94015"/>
+    <w:rsid w:val="003F4731"/>
     <w:rPr>
       <w:i/>
       <w:iCs/>
@@ -1102,7 +1194,7 @@
     <w:basedOn w:val="Normal"/>
     <w:uiPriority w:val="34"/>
     <w:qFormat/>
-    <w:rsid w:val="00A94015"/>
+    <w:rsid w:val="003F4731"/>
     <w:pPr>
       <w:ind w:left="720"/>
       <w:contextualSpacing/>
@@ -1113,7 +1205,7 @@
     <w:basedOn w:val="DefaultParagraphFont"/>
     <w:uiPriority w:val="21"/>
     <w:qFormat/>
-    <w:rsid w:val="00A94015"/>
+    <w:rsid w:val="003F4731"/>
     <w:rPr>
       <w:i/>
       <w:iCs/>
@@ -1127,7 +1219,7 @@
     <w:link w:val="IntenseQuoteChar"/>
     <w:uiPriority w:val="30"/>
     <w:qFormat/>
-    <w:rsid w:val="00A94015"/>
+    <w:rsid w:val="003F4731"/>
     <w:pPr>
       <w:pBdr>
         <w:top w:val="single" w:sz="4" w:space="10" w:color="0F4761" w:themeColor="accent1" w:themeShade="BF"/>
@@ -1148,7 +1240,7 @@
     <w:basedOn w:val="DefaultParagraphFont"/>
     <w:link w:val="IntenseQuote"/>
     <w:uiPriority w:val="30"/>
-    <w:rsid w:val="00A94015"/>
+    <w:rsid w:val="003F4731"/>
     <w:rPr>
       <w:i/>
       <w:iCs/>
@@ -1160,7 +1252,7 @@
     <w:basedOn w:val="DefaultParagraphFont"/>
     <w:uiPriority w:val="32"/>
     <w:qFormat/>
-    <w:rsid w:val="00A94015"/>
+    <w:rsid w:val="003F4731"/>
     <w:rPr>
       <w:b/>
       <w:bCs/>
@@ -1168,6 +1260,25 @@
       <w:color w:val="0F4761" w:themeColor="accent1" w:themeShade="BF"/>
       <w:spacing w:val="5"/>
     </w:rPr>
+  </w:style>
+  <w:style w:type="table" w:styleId="TableGrid">
+    <w:name w:val="Table Grid"/>
+    <w:basedOn w:val="TableNormal"/>
+    <w:uiPriority w:val="39"/>
+    <w:rsid w:val="003F4731"/>
+    <w:pPr>
+      <w:spacing w:after="0" w:line="240" w:lineRule="auto"/>
+    </w:pPr>
+    <w:tblPr>
+      <w:tblBorders>
+        <w:top w:val="single" w:sz="4" w:space="0" w:color="auto"/>
+        <w:left w:val="single" w:sz="4" w:space="0" w:color="auto"/>
+        <w:bottom w:val="single" w:sz="4" w:space="0" w:color="auto"/>
+        <w:right w:val="single" w:sz="4" w:space="0" w:color="auto"/>
+        <w:insideH w:val="single" w:sz="4" w:space="0" w:color="auto"/>
+        <w:insideV w:val="single" w:sz="4" w:space="0" w:color="auto"/>
+      </w:tblBorders>
+    </w:tblPr>
   </w:style>
 </w:styles>
 </file>
@@ -1378,13 +1489,6 @@
         </a:gradFill>
       </a:fillStyleLst>
       <a:lnStyleLst>
-        <a:ln w="6350" cap="flat" cmpd="sng" algn="ctr">
-          <a:solidFill>
-            <a:schemeClr val="phClr"/>
-          </a:solidFill>
-          <a:prstDash val="solid"/>
-          <a:miter lim="800000"/>
-        </a:ln>
         <a:ln w="12700" cap="flat" cmpd="sng" algn="ctr">
           <a:solidFill>
             <a:schemeClr val="phClr"/>
@@ -1393,6 +1497,13 @@
           <a:miter lim="800000"/>
         </a:ln>
         <a:ln w="19050" cap="flat" cmpd="sng" algn="ctr">
+          <a:solidFill>
+            <a:schemeClr val="phClr"/>
+          </a:solidFill>
+          <a:prstDash val="solid"/>
+          <a:miter lim="800000"/>
+        </a:ln>
+        <a:ln w="25400" cap="flat" cmpd="sng" algn="ctr">
           <a:solidFill>
             <a:schemeClr val="phClr"/>
           </a:solidFill>
@@ -1457,7 +1568,27 @@
       </a:bgFillStyleLst>
     </a:fmtScheme>
   </a:themeElements>
-  <a:objectDefaults/>
+  <a:objectDefaults>
+    <a:lnDef>
+      <a:spPr/>
+      <a:bodyPr/>
+      <a:lstStyle/>
+      <a:style>
+        <a:lnRef idx="2">
+          <a:schemeClr val="accent1"/>
+        </a:lnRef>
+        <a:fillRef idx="0">
+          <a:schemeClr val="accent1"/>
+        </a:fillRef>
+        <a:effectRef idx="1">
+          <a:schemeClr val="accent1"/>
+        </a:effectRef>
+        <a:fontRef idx="minor">
+          <a:schemeClr val="tx1"/>
+        </a:fontRef>
+      </a:style>
+    </a:lnDef>
+  </a:objectDefaults>
   <a:extraClrSchemeLst/>
   <a:extLst>
     <a:ext uri="{05A4C25C-085E-4340-85A3-A5531E510DB2}">

</xml_diff>